<commit_message>
Edition 9: Standardize all agency and advocate protection clauses per user template; eliminate external cross-references
Co-authored-by: arena-agent <297053741+arena-agent@users.noreply.github.com>
</commit_message>
<xml_diff>
--- a/Законы/Законопроекты/ACT. 002 — Ордера и неприкосновенность.docx
+++ b/Законы/Законопроекты/ACT. 002 — Ордера и неприкосновенность.docx
@@ -2444,7 +2444,7 @@
                 <w:sz w:val="24"/>
                 <w:szCs w:val="24"/>
               </w:rPr>
-              <w:t xml:space="preserve">ч. 5 Исполнение ордера, действие которого приостановлено или отозвано, влечет признание полученных доказательств недопустимыми в порядке статьи </w:t>
+              <w:t xml:space="preserve">ч. 5 Исполнение ордера, действие которого приостановлено или отозвано, влечет признание полученных доказательств недопустимыми в </w:t>
             </w:r>
             <w:r>
               <w:rPr>
@@ -2453,15 +2453,15 @@
                 <w:szCs w:val="24"/>
                 <w:shd w:val="clear" w:color="auto" w:fill="F4CCCC"/>
               </w:rPr>
-              <w:t xml:space="preserve">19</w:t>
-            </w:r>
-            <w:r>
-              <w:rPr>
-                <w:rFonts w:ascii="Times New Roman" w:eastAsia="Times New Roman" w:hAnsi="Times New Roman" w:cs="Times New Roman"/>
-                <w:sz w:val="24"/>
-                <w:szCs w:val="24"/>
-              </w:rPr>
-              <w:t xml:space="preserve"> Процессуального кодекса штата Сан-Андреас, а также ответственность, предусмотренную законодательством штата Сан-Андреас.</w:t>
+              <w:t xml:space="preserve">порядке статьи 19 Процессуального кодекса штата Сан-Андреас,</w:t>
+            </w:r>
+            <w:r>
+              <w:rPr>
+                <w:rFonts w:ascii="Times New Roman" w:eastAsia="Times New Roman" w:hAnsi="Times New Roman" w:cs="Times New Roman"/>
+                <w:sz w:val="24"/>
+                <w:szCs w:val="24"/>
+              </w:rPr>
+              <w:t xml:space="preserve"> а также ответственность, предусмотренную законодательством штата Сан-Андреас.</w:t>
             </w:r>
           </w:p>
         </w:tc>
@@ -2557,7 +2557,7 @@
                 <w:sz w:val="24"/>
                 <w:szCs w:val="24"/>
               </w:rPr>
-              <w:t xml:space="preserve">ч. 5 Исполнение ордера, действие которого приостановлено или отозвано, влечет признание полученных доказательств недопустимыми в порядке статьи </w:t>
+              <w:t xml:space="preserve">ч. 5 Исполнение ордера, действие которого приостановлено или отозвано, влечет признание полученных доказательств недопустимыми в </w:t>
             </w:r>
             <w:r>
               <w:rPr>
@@ -2566,15 +2566,15 @@
                 <w:szCs w:val="24"/>
                 <w:shd w:val="clear" w:color="auto" w:fill="D9EAD3"/>
               </w:rPr>
-              <w:t xml:space="preserve">12</w:t>
-            </w:r>
-            <w:r>
-              <w:rPr>
-                <w:rFonts w:ascii="Times New Roman" w:eastAsia="Times New Roman" w:hAnsi="Times New Roman" w:cs="Times New Roman"/>
-                <w:sz w:val="24"/>
-                <w:szCs w:val="24"/>
-              </w:rPr>
-              <w:t xml:space="preserve"> Процессуального кодекса штата Сан-Андреас, а также ответственность, предусмотренную законодательством штата Сан-Андреас.</w:t>
+              <w:t xml:space="preserve">порядке, установленном действующим законодательством штата San-Andreas,</w:t>
+            </w:r>
+            <w:r>
+              <w:rPr>
+                <w:rFonts w:ascii="Times New Roman" w:eastAsia="Times New Roman" w:hAnsi="Times New Roman" w:cs="Times New Roman"/>
+                <w:sz w:val="24"/>
+                <w:szCs w:val="24"/>
+              </w:rPr>
+              <w:t xml:space="preserve"> а также ответственность, предусмотренную законодательством штата Сан-Андреас.</w:t>
             </w:r>
           </w:p>
         </w:tc>

</xml_diff>